<commit_message>
fix: automate chat tools and deliver downloadable Chinese Word documents
Raise Responses reasoning/output budgets, clear accepted drafts across composer remounts, and recover legacy waiting tasks without manual approvals. Preserve scope, ownership, argument and explicit-block checks.\n\nReplace DOCX base64 results with authenticated download references, retain safe references in durable replay, and embed OFL Chinese fonts across normal and fallback exports.\n\nValidated with 347 test files / 2422 tests, TypeScript, lint, production build and real desktop/mobile Word download flows.
</commit_message>
<xml_diff>
--- a/assets/export/reference.docx
+++ b/assets/export/reference.docx
@@ -248,6 +248,7 @@
         <w:rFonts w:ascii="Noto Sans SC" w:cs="Noto Sans SC" w:eastAsia="Noto Sans SC" w:hAnsi="Noto Sans SC"/>
         <w:sz w:val="22"/>
         <w:szCs w:val="22"/>
+        <w:lang w:val="en-US" w:eastAsia="zh-CN"/>
       </w:rPr>
     </w:rPrDefault>
     <w:pPrDefault>
@@ -262,8 +263,11 @@
     <w:next w:val="Normal"/>
     <w:qFormat/>
     <w:rPr>
-      <w:sz w:val="56"/>
-      <w:szCs w:val="56"/>
+      <w:rFonts w:ascii="Noto Sans SC" w:cs="Noto Sans SC" w:eastAsia="Noto Sans SC" w:hAnsi="Noto Sans SC"/>
+      <w:b/>
+      <w:bCs/>
+      <w:sz w:val="36"/>
+      <w:szCs w:val="36"/>
     </w:rPr>
   </w:style>
   <w:style w:type="paragraph" w:styleId="Heading1">
@@ -271,8 +275,16 @@
     <w:basedOn w:val="Normal"/>
     <w:next w:val="Normal"/>
     <w:qFormat/>
-    <w:rPr>
-      <w:color w:val="2E74B5"/>
+    <w:pPr>
+      <w:keepNext/>
+      <w:spacing w:after="160" w:before="280"/>
+      <w:outlineLvl w:val="0"/>
+    </w:pPr>
+    <w:rPr>
+      <w:rFonts w:ascii="Noto Sans SC" w:cs="Noto Sans SC" w:eastAsia="Noto Sans SC" w:hAnsi="Noto Sans SC"/>
+      <w:b/>
+      <w:bCs/>
+      <w:color w:val="222222"/>
       <w:sz w:val="32"/>
       <w:szCs w:val="32"/>
     </w:rPr>
@@ -282,10 +294,18 @@
     <w:basedOn w:val="Normal"/>
     <w:next w:val="Normal"/>
     <w:qFormat/>
-    <w:rPr>
-      <w:color w:val="2E74B5"/>
-      <w:sz w:val="26"/>
-      <w:szCs w:val="26"/>
+    <w:pPr>
+      <w:keepNext/>
+      <w:spacing w:after="160" w:before="280"/>
+      <w:outlineLvl w:val="1"/>
+    </w:pPr>
+    <w:rPr>
+      <w:rFonts w:ascii="Noto Sans SC" w:cs="Noto Sans SC" w:eastAsia="Noto Sans SC" w:hAnsi="Noto Sans SC"/>
+      <w:b/>
+      <w:bCs/>
+      <w:color w:val="222222"/>
+      <w:sz w:val="28"/>
+      <w:szCs w:val="28"/>
     </w:rPr>
   </w:style>
   <w:style w:type="paragraph" w:styleId="Heading3">
@@ -293,8 +313,16 @@
     <w:basedOn w:val="Normal"/>
     <w:next w:val="Normal"/>
     <w:qFormat/>
-    <w:rPr>
-      <w:color w:val="1F4D78"/>
+    <w:pPr>
+      <w:keepNext/>
+      <w:spacing w:after="160" w:before="280"/>
+      <w:outlineLvl w:val="2"/>
+    </w:pPr>
+    <w:rPr>
+      <w:rFonts w:ascii="Noto Sans SC" w:cs="Noto Sans SC" w:eastAsia="Noto Sans SC" w:hAnsi="Noto Sans SC"/>
+      <w:b/>
+      <w:bCs/>
+      <w:color w:val="222222"/>
       <w:sz w:val="24"/>
       <w:szCs w:val="24"/>
     </w:rPr>
@@ -304,10 +332,18 @@
     <w:basedOn w:val="Normal"/>
     <w:next w:val="Normal"/>
     <w:qFormat/>
-    <w:rPr>
-      <w:i/>
-      <w:iCs/>
-      <w:color w:val="2E74B5"/>
+    <w:pPr>
+      <w:keepNext/>
+      <w:spacing w:after="160" w:before="280"/>
+      <w:outlineLvl w:val="3"/>
+    </w:pPr>
+    <w:rPr>
+      <w:rFonts w:ascii="Noto Sans SC" w:cs="Noto Sans SC" w:eastAsia="Noto Sans SC" w:hAnsi="Noto Sans SC"/>
+      <w:b/>
+      <w:bCs/>
+      <w:color w:val="222222"/>
+      <w:sz w:val="24"/>
+      <w:szCs w:val="24"/>
     </w:rPr>
   </w:style>
   <w:style w:type="paragraph" w:styleId="Heading5">
@@ -315,8 +351,18 @@
     <w:basedOn w:val="Normal"/>
     <w:next w:val="Normal"/>
     <w:qFormat/>
-    <w:rPr>
-      <w:color w:val="2E74B5"/>
+    <w:pPr>
+      <w:keepNext/>
+      <w:spacing w:after="160" w:before="280"/>
+      <w:outlineLvl w:val="4"/>
+    </w:pPr>
+    <w:rPr>
+      <w:rFonts w:ascii="Noto Sans SC" w:cs="Noto Sans SC" w:eastAsia="Noto Sans SC" w:hAnsi="Noto Sans SC"/>
+      <w:b/>
+      <w:bCs/>
+      <w:color w:val="222222"/>
+      <w:sz w:val="22"/>
+      <w:szCs w:val="22"/>
     </w:rPr>
   </w:style>
   <w:style w:type="paragraph" w:styleId="Heading6">
@@ -324,8 +370,18 @@
     <w:basedOn w:val="Normal"/>
     <w:next w:val="Normal"/>
     <w:qFormat/>
-    <w:rPr>
-      <w:color w:val="1F4D78"/>
+    <w:pPr>
+      <w:keepNext/>
+      <w:spacing w:after="160" w:before="280"/>
+      <w:outlineLvl w:val="5"/>
+    </w:pPr>
+    <w:rPr>
+      <w:rFonts w:ascii="Noto Sans SC" w:cs="Noto Sans SC" w:eastAsia="Noto Sans SC" w:hAnsi="Noto Sans SC"/>
+      <w:b/>
+      <w:bCs/>
+      <w:color w:val="222222"/>
+      <w:sz w:val="22"/>
+      <w:szCs w:val="22"/>
     </w:rPr>
   </w:style>
   <w:style w:type="paragraph" w:styleId="Strong">
@@ -427,59 +483,5 @@
       <w:szCs w:val="20"/>
     </w:rPr>
   </w:style>
-  <w:style w:type="paragraph" w:styleId="Heading1">
-    <w:name w:val="Heading 1"/>
-    <w:basedOn w:val="Normal"/>
-    <w:next w:val="Normal"/>
-    <w:qFormat/>
-    <w:pPr>
-      <w:keepNext/>
-      <w:spacing w:after="200" w:before="360"/>
-      <w:outlineLvl w:val="0"/>
-    </w:pPr>
-    <w:rPr>
-      <w:rFonts w:ascii="Noto Sans SC" w:cs="Noto Sans SC" w:eastAsia="Noto Sans SC" w:hAnsi="Noto Sans SC"/>
-      <w:b/>
-      <w:bCs/>
-      <w:sz w:val="32"/>
-      <w:szCs w:val="32"/>
-    </w:rPr>
-  </w:style>
-  <w:style w:type="paragraph" w:styleId="Heading2">
-    <w:name w:val="Heading 2"/>
-    <w:basedOn w:val="Normal"/>
-    <w:next w:val="Normal"/>
-    <w:qFormat/>
-    <w:pPr>
-      <w:keepNext/>
-      <w:spacing w:after="160" w:before="280"/>
-      <w:outlineLvl w:val="1"/>
-    </w:pPr>
-    <w:rPr>
-      <w:rFonts w:ascii="Noto Sans SC" w:cs="Noto Sans SC" w:eastAsia="Noto Sans SC" w:hAnsi="Noto Sans SC"/>
-      <w:b/>
-      <w:bCs/>
-      <w:sz w:val="28"/>
-      <w:szCs w:val="28"/>
-    </w:rPr>
-  </w:style>
-  <w:style w:type="paragraph" w:styleId="Heading3">
-    <w:name w:val="Heading 3"/>
-    <w:basedOn w:val="Normal"/>
-    <w:next w:val="Normal"/>
-    <w:qFormat/>
-    <w:pPr>
-      <w:keepNext/>
-      <w:spacing w:after="120" w:before="220"/>
-      <w:outlineLvl w:val="2"/>
-    </w:pPr>
-    <w:rPr>
-      <w:rFonts w:ascii="Noto Sans SC" w:cs="Noto Sans SC" w:eastAsia="Noto Sans SC" w:hAnsi="Noto Sans SC"/>
-      <w:b/>
-      <w:bCs/>
-      <w:sz w:val="24"/>
-      <w:szCs w:val="24"/>
-    </w:rPr>
-  </w:style>
 </w:styles>
 </file>
</xml_diff>